<commit_message>
Methods: one ITO constant set (König) for every calculation, confirmed against the author's material library
Co-Authored-By: Claude Fable 5.1 <noreply@anthropic.com>
Claude-Session: https://claude.ai/code/session_01A1WQ3WGcJw8tT3QK2n57xo
</commit_message>
<xml_diff>
--- a/manuscript/unityEQE_v22_ko.docx
+++ b/manuscript/unityEQE_v22_ko.docx
@@ -518,7 +518,7 @@
         <w:rPr>
           <w:b w:val="0"/>
         </w:rPr>
-        <w:t>설계 규칙 계산(그림 2, 3, 5(c), 5(d), 표 1)은 550 nm 단파장에서 PLQY = 1, 등방성 배향(horizontal dipole ratio Θ = 2/3; 그림 5(c)만 Θ 가변)으로 수행하였다. 그림 2, 3(a), 3(b), 5(c), 5(d)에서는 전하수송층과 발광층을 가시광선 대역에서 흡수가 없는 n = 1.8의 등방성 매질로, 그림 3(c)에서는 ETL만 이방성(n_o = 1.8, n_e 가변)으로 두었고, 이 계산의 ITO는 König 등[21]이 보고한 값(refractiveindex.info; 550 nm에서 n = 1.864, k = 0.0032)을 사용하였다. 그림 5(a), (b)는 실제 재료 스택 반사체 100 nm/B3PyMPM d_ETL/TCTA:B3PyMPM 25 nm(발광 위치 중앙)/TAPC d_HTL/ITO 50 nm/기판에 대해 ETL과 HTL 두께를 10–500 nm 범위에서 바꾸며 계산한 것으로, (a)는 Al 반사체와 n_sub = 1.5의 평면 기판, (b)는 Ag 반사체와 n_sub = 1.8 기판 위의 반구형 microlens array(n_MLA = 1.8, 급수 20항)이다. 파장은 530–580 nm(1 nm 간격)이며 Ir(ppy)₂acac의 발광 스펙트럼을 광자 수로 가중하였고, PLQY = 1, Θ = 2/3, 면내 파수 격자는 u = k_∥/(n_EML k₀) 기준 단위당 1,000점(최대 u = 3)이다. 그림 5(e)의 산란층은 기판과 굴절률이 정합된 무흡수 층으로, Henyey–Greenstein 위상함수(비대칭 인자 g = 0.5–1.0)와 산란 광학 두께 S = μ_s d = 1–15에 대해 BSDF를 몬테카를로 광선 추적(입사각 빈당 5×10⁴–10⁵ 광자)으로 생성하고, 400–800 nm(1 nm 간격)의 Ir(ppy)₂acac 발광 스펙트럼, PLQY = 0.98, Θ = 0.76의 소자([[확인: Ag 또는 Al 100 nm/B3PyMPM 500 nm/TCTA 25 nm/TCTA:B3PyMPM 10 nm/(TAPC 500 nm/HATCN 3 nm)×3/ITO 50 nm/기판 n = 1.51 또는 1.8]])에 대해 20회 왕복까지 급수를 합하여 EQE를 구하였다. 광학상수는 그림 2, 3의 ITO를 제외하면 모두 실측값이다. Al, IZO, 유기물, ZnS, LiF는 분광 타원측정(spectroscopic ellipsometry)으로 측정한 값을, 그림 4, 5의 ITO는 실측값([[확인: 550 nm에서 n = 2.00, k = 0.0013]])을, Ag는 McPeak 등[24]의 값을 사용하였다. 그림 4의 소자 시뮬레이션에도 각 층의 실측 광학상수를 사용하였다. 표 1의 실제 재료 스택 계산은 550 nm에서 각 층의 실측 광학상수(B3PyMPM과 TCTA:B3PyMPM, TAPC는 이방성 포함)로 P_sub와 R_LED를 구하고, 그림 5와 같은 반구형 microlens array(n_MLA = 1.8)의 BSDF로 급수를 합하여 얻었다.</w:t>
+        <w:t>설계 규칙 계산(그림 2, 3, 5(c), 5(d), 표 1)은 550 nm 단파장에서 PLQY = 1, 등방성 배향(horizontal dipole ratio Θ = 2/3; 그림 5(c)만 Θ 가변)으로 수행하였다. 그림 2, 3(a), 3(b), 5(c), 5(d)에서는 전하수송층과 발광층을 가시광선 대역에서 흡수가 없는 n = 1.8의 등방성 매질로, 그림 3(c)에서는 ETL만 이방성(n_o = 1.8, n_e 가변)으로 두었다. 그림 5(a), (b)는 실제 재료 스택 반사체 100 nm/B3PyMPM d_ETL/TCTA:B3PyMPM 25 nm(발광 위치 중앙)/TAPC d_HTL/ITO 50 nm/기판에 대해 ETL과 HTL 두께를 10–500 nm 범위에서 바꾸며 계산한 것으로, (a)는 Al 반사체와 n_sub = 1.5의 평면 기판, (b)는 Ag 반사체와 n_sub = 1.8 기판 위의 반구형 microlens array(n_MLA = 1.8, 급수 20항)이다. 파장은 530–580 nm(1 nm 간격)이며 Ir(ppy)₂acac의 발광 스펙트럼을 광자 수로 가중하였고, PLQY = 1, Θ = 2/3, 면내 파수 격자는 u = k_∥/(n_EML k₀) 기준 단위당 1,000점(최대 u = 3)이다. 그림 5(e)의 산란층은 기판과 굴절률이 정합된 무흡수 층으로, Henyey–Greenstein 위상함수(비대칭 인자 g = 0.5–1.0)와 산란 광학 두께 S = μ_s d = 1–15에 대해 BSDF를 몬테카를로 광선 추적(입사각 빈당 5×10⁴–10⁵ 광자)으로 생성하고, 400–800 nm(1 nm 간격)의 Ir(ppy)₂acac 발광 스펙트럼, PLQY = 0.98, Θ = 0.76의 소자([[확인: Ag 또는 Al 100 nm/B3PyMPM 500 nm/TCTA 25 nm/TCTA:B3PyMPM 10 nm/(TAPC 500 nm/HATCN 3 nm)×3/ITO 50 nm/기판 n = 1.51 또는 1.8]])에 대해 20회 왕복까지 급수를 합하여 EQE를 구하였다. 광학상수는 모든 계산에서 ITO만 König 등[21]이 보고한 값(refractiveindex.info; 550 nm에서 n = 1.864, k = 0.0032, 530–580 nm에서 n = 1.83–1.88)을 사용하였고, Al, IZO, 유기물, ZnS, LiF는 분광 타원측정(spectroscopic ellipsometry)으로 측정한 값을, Ag는 McPeak 등[24]의 값을 사용하였다. 그림 4의 소자 시뮬레이션에도 각 층의 실측 광학상수를 사용하였다. 표 1의 실제 재료 스택 계산은 550 nm에서 각 층의 실측 광학상수(B3PyMPM과 TCTA:B3PyMPM, TAPC는 이방성 포함)로 P_sub와 R_LED를 구하고, 그림 5와 같은 반구형 microlens array(n_MLA = 1.8)의 BSDF로 급수를 합하여 얻었다.</w:t>
       </w:r>
     </w:p>
     <w:p/>
@@ -2455,7 +2455,7 @@
         <w:rPr>
           <w:b w:val="0"/>
         </w:rPr>
-        <w:t>1. 제목·저자·소속·교신저자. 2. 서론의 산업계 발표 인용 여부. 3. Methods: 기준 소자 정의, EQE 산출 방법, 그림 4·5의 ITO 광학상수, 그림 5(e)의 스택. 4. 그림 5(e)의 기판 굴절률. 5. 참고문헌 [12], [16]–[19], [21], [22].</w:t>
+        <w:t>1. 제목·저자·소속·교신저자. 2. 서론의 산업계 발표 인용 여부. 3. Methods: 기준 소자 정의, EQE 산출 방법, 그림 5(e)의 스택. 4. 그림 5(e)의 기판 굴절률. 5. 참고문헌 [12], [16]–[19], [21], [22].</w:t>
       </w:r>
     </w:p>
     <w:p/>

</xml_diff>